<commit_message>
Tambah login siswa, sinkronisasi progres, dan Dasbor Guru berbasis Firebase
- js/core/cloud.js: Firebase Authentication (email/kata sandi) dan Cloud
  Firestore; progres siswa tersimpan otomatis di progress/{uid}
- Halaman Masuk (#/masuk): daftar/masuk siswa, masuk guru, lupa kata sandi
- Dasbor Guru (#/guru): rekap semua siswa, filter kelas, capaian per TP,
  rincian per siswa termasuk jawaban uraian, unduh rekap CSV
- firestore.rules: siswa hanya mengakses datanya sendiri, guru (dokumen
  teachers/{uid}) membaca semua; diuji 17 skenario di Firebase Emulator
- Firebase JS SDK 10.14.1 (compat) disimpan lokal di vendor/firebase
- Tanpa konfigurasi di js/firebase-config.js website tetap berjalan tanpa login
- docs/TUTORIAL_FIREBASE.md (+ DOCX/PDF): tutorial penyiapan lengkap

Co-Authored-By: Claude Opus 5.5 <noreply@anthropic.com>
Claude-Session: https://claude.ai/code/session_0129ryr42iuGGCdByrSF5R7U
</commit_message>
<xml_diff>
--- a/docs/Indeks_Proyek_GeoMatch.docx
+++ b/docs/Indeks_Proyek_GeoMatch.docx
@@ -577,6 +577,7 @@
             </w:r>
             <w:r>
               <w:rPr>
+                <w:rStyle w:val="InlineCode"/>
                 <w:rFonts w:ascii="Consolas" w:cs="Consolas" w:eastAsia="Consolas" w:hAnsi="Consolas"/>
                 <w:color w:val="334155"/>
                 <w:sz w:val="17"/>
@@ -651,6 +652,7 @@
             </w:pPr>
             <w:r>
               <w:rPr>
+                <w:rStyle w:val="InlineCode"/>
                 <w:rFonts w:ascii="Consolas" w:cs="Consolas" w:eastAsia="Consolas" w:hAnsi="Consolas"/>
                 <w:color w:val="334155"/>
                 <w:sz w:val="17"/>
@@ -668,6 +670,7 @@
             </w:r>
             <w:r>
               <w:rPr>
+                <w:rStyle w:val="InlineCode"/>
                 <w:rFonts w:ascii="Consolas" w:cs="Consolas" w:eastAsia="Consolas" w:hAnsi="Consolas"/>
                 <w:color w:val="334155"/>
                 <w:sz w:val="17"/>
@@ -1678,6 +1681,7 @@
             </w:pPr>
             <w:r>
               <w:rPr>
+                <w:rStyle w:val="InlineCode"/>
                 <w:rFonts w:ascii="Consolas" w:cs="Consolas" w:eastAsia="Consolas" w:hAnsi="Consolas"/>
                 <w:color w:val="334155"/>
                 <w:sz w:val="17"/>
@@ -1804,6 +1808,7 @@
             </w:pPr>
             <w:r>
               <w:rPr>
+                <w:rStyle w:val="InlineCode"/>
                 <w:rFonts w:ascii="Consolas" w:cs="Consolas" w:eastAsia="Consolas" w:hAnsi="Consolas"/>
                 <w:color w:val="334155"/>
                 <w:sz w:val="17"/>
@@ -1930,6 +1935,7 @@
             </w:pPr>
             <w:r>
               <w:rPr>
+                <w:rStyle w:val="InlineCode"/>
                 <w:rFonts w:ascii="Consolas" w:cs="Consolas" w:eastAsia="Consolas" w:hAnsi="Consolas"/>
                 <w:color w:val="334155"/>
                 <w:sz w:val="17"/>
@@ -2056,6 +2062,7 @@
             </w:pPr>
             <w:r>
               <w:rPr>
+                <w:rStyle w:val="InlineCode"/>
                 <w:rFonts w:ascii="Consolas" w:cs="Consolas" w:eastAsia="Consolas" w:hAnsi="Consolas"/>
                 <w:color w:val="334155"/>
                 <w:sz w:val="17"/>
@@ -2182,6 +2189,7 @@
             </w:pPr>
             <w:r>
               <w:rPr>
+                <w:rStyle w:val="InlineCode"/>
                 <w:rFonts w:ascii="Consolas" w:cs="Consolas" w:eastAsia="Consolas" w:hAnsi="Consolas"/>
                 <w:color w:val="334155"/>
                 <w:sz w:val="17"/>
@@ -2308,6 +2316,7 @@
             </w:pPr>
             <w:r>
               <w:rPr>
+                <w:rStyle w:val="InlineCode"/>
                 <w:rFonts w:ascii="Consolas" w:cs="Consolas" w:eastAsia="Consolas" w:hAnsi="Consolas"/>
                 <w:color w:val="334155"/>
                 <w:sz w:val="17"/>
@@ -2434,6 +2443,7 @@
             </w:pPr>
             <w:r>
               <w:rPr>
+                <w:rStyle w:val="InlineCode"/>
                 <w:rFonts w:ascii="Consolas" w:cs="Consolas" w:eastAsia="Consolas" w:hAnsi="Consolas"/>
                 <w:color w:val="334155"/>
                 <w:sz w:val="17"/>
@@ -2560,6 +2570,7 @@
             </w:pPr>
             <w:r>
               <w:rPr>
+                <w:rStyle w:val="InlineCode"/>
                 <w:rFonts w:ascii="Consolas" w:cs="Consolas" w:eastAsia="Consolas" w:hAnsi="Consolas"/>
                 <w:color w:val="334155"/>
                 <w:sz w:val="17"/>
@@ -2596,6 +2607,260 @@
                 <w:szCs w:val="19"/>
               </w:rPr>
               <w:t xml:space="preserve">Laporan akhir investigasi dan capaian per TP</w:t>
+            </w:r>
+          </w:p>
+        </w:tc>
+      </w:tr>
+      <w:tr>
+        <w:trPr>
+          <w:cantSplit/>
+        </w:trPr>
+        <w:tc>
+          <w:tcPr>
+            <w:tcW w:type="dxa" w:w="556"/>
+            <w:tcBorders>
+              <w:top w:val="single" w:color="CBD5E1" w:sz="4"/>
+              <w:left w:val="single" w:color="CBD5E1" w:sz="4"/>
+              <w:bottom w:val="single" w:color="CBD5E1" w:sz="4"/>
+              <w:right w:val="single" w:color="CBD5E1" w:sz="4"/>
+            </w:tcBorders>
+            <w:tcMar>
+              <w:top w:type="dxa" w:w="60"/>
+              <w:left w:type="dxa" w:w="100"/>
+              <w:bottom w:type="dxa" w:w="60"/>
+              <w:right w:type="dxa" w:w="100"/>
+            </w:tcMar>
+          </w:tcPr>
+          <w:p>
+            <w:pPr>
+              <w:spacing w:after="0" w:before="0"/>
+            </w:pPr>
+            <w:r>
+              <w:rPr>
+                <w:rFonts w:ascii="Calibri" w:cs="Calibri" w:eastAsia="Calibri" w:hAnsi="Calibri"/>
+                <w:sz w:val="19"/>
+                <w:szCs w:val="19"/>
+              </w:rPr>
+              <w:t xml:space="preserve">9</w:t>
+            </w:r>
+          </w:p>
+        </w:tc>
+        <w:tc>
+          <w:tcPr>
+            <w:tcW w:type="dxa" w:w="1204"/>
+            <w:tcBorders>
+              <w:top w:val="single" w:color="CBD5E1" w:sz="4"/>
+              <w:left w:val="single" w:color="CBD5E1" w:sz="4"/>
+              <w:bottom w:val="single" w:color="CBD5E1" w:sz="4"/>
+              <w:right w:val="single" w:color="CBD5E1" w:sz="4"/>
+            </w:tcBorders>
+            <w:tcMar>
+              <w:top w:type="dxa" w:w="60"/>
+              <w:left w:type="dxa" w:w="100"/>
+              <w:bottom w:type="dxa" w:w="60"/>
+              <w:right w:type="dxa" w:w="100"/>
+            </w:tcMar>
+          </w:tcPr>
+          <w:p>
+            <w:pPr>
+              <w:spacing w:after="0" w:before="0"/>
+            </w:pPr>
+            <w:r>
+              <w:rPr>
+                <w:rFonts w:ascii="Calibri" w:cs="Calibri" w:eastAsia="Calibri" w:hAnsi="Calibri"/>
+                <w:sz w:val="19"/>
+                <w:szCs w:val="19"/>
+              </w:rPr>
+              <w:t xml:space="preserve">Masuk</w:t>
+            </w:r>
+          </w:p>
+        </w:tc>
+        <w:tc>
+          <w:tcPr>
+            <w:tcW w:type="dxa" w:w="1390"/>
+            <w:tcBorders>
+              <w:top w:val="single" w:color="CBD5E1" w:sz="4"/>
+              <w:left w:val="single" w:color="CBD5E1" w:sz="4"/>
+              <w:bottom w:val="single" w:color="CBD5E1" w:sz="4"/>
+              <w:right w:val="single" w:color="CBD5E1" w:sz="4"/>
+            </w:tcBorders>
+            <w:tcMar>
+              <w:top w:type="dxa" w:w="60"/>
+              <w:left w:type="dxa" w:w="100"/>
+              <w:bottom w:type="dxa" w:w="60"/>
+              <w:right w:type="dxa" w:w="100"/>
+            </w:tcMar>
+          </w:tcPr>
+          <w:p>
+            <w:pPr>
+              <w:spacing w:after="0" w:before="0"/>
+            </w:pPr>
+            <w:r>
+              <w:rPr>
+                <w:rStyle w:val="InlineCode"/>
+                <w:rFonts w:ascii="Consolas" w:cs="Consolas" w:eastAsia="Consolas" w:hAnsi="Consolas"/>
+                <w:color w:val="334155"/>
+                <w:sz w:val="17"/>
+                <w:szCs w:val="17"/>
+              </w:rPr>
+              <w:t xml:space="preserve">#/masuk</w:t>
+            </w:r>
+          </w:p>
+        </w:tc>
+        <w:tc>
+          <w:tcPr>
+            <w:tcW w:type="dxa" w:w="6488"/>
+            <w:tcBorders>
+              <w:top w:val="single" w:color="CBD5E1" w:sz="4"/>
+              <w:left w:val="single" w:color="CBD5E1" w:sz="4"/>
+              <w:bottom w:val="single" w:color="CBD5E1" w:sz="4"/>
+              <w:right w:val="single" w:color="CBD5E1" w:sz="4"/>
+            </w:tcBorders>
+            <w:tcMar>
+              <w:top w:type="dxa" w:w="60"/>
+              <w:left w:type="dxa" w:w="100"/>
+              <w:bottom w:type="dxa" w:w="60"/>
+              <w:right w:type="dxa" w:w="100"/>
+            </w:tcMar>
+          </w:tcPr>
+          <w:p>
+            <w:pPr>
+              <w:spacing w:after="0" w:before="0"/>
+            </w:pPr>
+            <w:r>
+              <w:rPr>
+                <w:rFonts w:ascii="Calibri" w:cs="Calibri" w:eastAsia="Calibri" w:hAnsi="Calibri"/>
+                <w:sz w:val="19"/>
+                <w:szCs w:val="19"/>
+              </w:rPr>
+              <w:t xml:space="preserve">Daftar/masuk siswa, masuk guru, lupa kata sandi (jika Firebase aktif)</w:t>
+            </w:r>
+          </w:p>
+        </w:tc>
+      </w:tr>
+      <w:tr>
+        <w:trPr>
+          <w:cantSplit/>
+        </w:trPr>
+        <w:tc>
+          <w:tcPr>
+            <w:tcW w:type="dxa" w:w="556"/>
+            <w:tcBorders>
+              <w:top w:val="single" w:color="CBD5E1" w:sz="4"/>
+              <w:left w:val="single" w:color="CBD5E1" w:sz="4"/>
+              <w:bottom w:val="single" w:color="CBD5E1" w:sz="4"/>
+              <w:right w:val="single" w:color="CBD5E1" w:sz="4"/>
+            </w:tcBorders>
+            <w:tcMar>
+              <w:top w:type="dxa" w:w="60"/>
+              <w:left w:type="dxa" w:w="100"/>
+              <w:bottom w:type="dxa" w:w="60"/>
+              <w:right w:type="dxa" w:w="100"/>
+            </w:tcMar>
+          </w:tcPr>
+          <w:p>
+            <w:pPr>
+              <w:spacing w:after="0" w:before="0"/>
+            </w:pPr>
+            <w:r>
+              <w:rPr>
+                <w:rFonts w:ascii="Calibri" w:cs="Calibri" w:eastAsia="Calibri" w:hAnsi="Calibri"/>
+                <w:sz w:val="19"/>
+                <w:szCs w:val="19"/>
+              </w:rPr>
+              <w:t xml:space="preserve">10</w:t>
+            </w:r>
+          </w:p>
+        </w:tc>
+        <w:tc>
+          <w:tcPr>
+            <w:tcW w:type="dxa" w:w="1204"/>
+            <w:tcBorders>
+              <w:top w:val="single" w:color="CBD5E1" w:sz="4"/>
+              <w:left w:val="single" w:color="CBD5E1" w:sz="4"/>
+              <w:bottom w:val="single" w:color="CBD5E1" w:sz="4"/>
+              <w:right w:val="single" w:color="CBD5E1" w:sz="4"/>
+            </w:tcBorders>
+            <w:tcMar>
+              <w:top w:type="dxa" w:w="60"/>
+              <w:left w:type="dxa" w:w="100"/>
+              <w:bottom w:type="dxa" w:w="60"/>
+              <w:right w:type="dxa" w:w="100"/>
+            </w:tcMar>
+          </w:tcPr>
+          <w:p>
+            <w:pPr>
+              <w:spacing w:after="0" w:before="0"/>
+            </w:pPr>
+            <w:r>
+              <w:rPr>
+                <w:rFonts w:ascii="Calibri" w:cs="Calibri" w:eastAsia="Calibri" w:hAnsi="Calibri"/>
+                <w:sz w:val="19"/>
+                <w:szCs w:val="19"/>
+              </w:rPr>
+              <w:t xml:space="preserve">Dasbor Guru</w:t>
+            </w:r>
+          </w:p>
+        </w:tc>
+        <w:tc>
+          <w:tcPr>
+            <w:tcW w:type="dxa" w:w="1390"/>
+            <w:tcBorders>
+              <w:top w:val="single" w:color="CBD5E1" w:sz="4"/>
+              <w:left w:val="single" w:color="CBD5E1" w:sz="4"/>
+              <w:bottom w:val="single" w:color="CBD5E1" w:sz="4"/>
+              <w:right w:val="single" w:color="CBD5E1" w:sz="4"/>
+            </w:tcBorders>
+            <w:tcMar>
+              <w:top w:type="dxa" w:w="60"/>
+              <w:left w:type="dxa" w:w="100"/>
+              <w:bottom w:type="dxa" w:w="60"/>
+              <w:right w:type="dxa" w:w="100"/>
+            </w:tcMar>
+          </w:tcPr>
+          <w:p>
+            <w:pPr>
+              <w:spacing w:after="0" w:before="0"/>
+            </w:pPr>
+            <w:r>
+              <w:rPr>
+                <w:rStyle w:val="InlineCode"/>
+                <w:rFonts w:ascii="Consolas" w:cs="Consolas" w:eastAsia="Consolas" w:hAnsi="Consolas"/>
+                <w:color w:val="334155"/>
+                <w:sz w:val="17"/>
+                <w:szCs w:val="17"/>
+              </w:rPr>
+              <w:t xml:space="preserve">#/guru</w:t>
+            </w:r>
+          </w:p>
+        </w:tc>
+        <w:tc>
+          <w:tcPr>
+            <w:tcW w:type="dxa" w:w="6488"/>
+            <w:tcBorders>
+              <w:top w:val="single" w:color="CBD5E1" w:sz="4"/>
+              <w:left w:val="single" w:color="CBD5E1" w:sz="4"/>
+              <w:bottom w:val="single" w:color="CBD5E1" w:sz="4"/>
+              <w:right w:val="single" w:color="CBD5E1" w:sz="4"/>
+            </w:tcBorders>
+            <w:tcMar>
+              <w:top w:type="dxa" w:w="60"/>
+              <w:left w:type="dxa" w:w="100"/>
+              <w:bottom w:type="dxa" w:w="60"/>
+              <w:right w:type="dxa" w:w="100"/>
+            </w:tcMar>
+          </w:tcPr>
+          <w:p>
+            <w:pPr>
+              <w:spacing w:after="0" w:before="0"/>
+            </w:pPr>
+            <w:r>
+              <w:rPr>
+                <w:rFonts w:ascii="Calibri" w:cs="Calibri" w:eastAsia="Calibri" w:hAnsi="Calibri"/>
+                <w:sz w:val="19"/>
+                <w:szCs w:val="19"/>
+              </w:rPr>
+              <w:t xml:space="preserve">Rekap seluruh siswa, filter kelas, capaian per TP, rincian dan jawaban uraian, unduh CSV</w:t>
             </w:r>
           </w:p>
         </w:tc>
@@ -2734,6 +2999,7 @@
             </w:r>
             <w:r>
               <w:rPr>
+                <w:rStyle w:val="InlineCode"/>
                 <w:rFonts w:ascii="Consolas" w:cs="Consolas" w:eastAsia="Consolas" w:hAnsi="Consolas"/>
                 <w:b/>
                 <w:bCs/>
@@ -2881,6 +3147,7 @@
             </w:pPr>
             <w:r>
               <w:rPr>
+                <w:rStyle w:val="InlineCode"/>
                 <w:rFonts w:ascii="Consolas" w:cs="Consolas" w:eastAsia="Consolas" w:hAnsi="Consolas"/>
                 <w:color w:val="334155"/>
                 <w:sz w:val="17"/>
@@ -3007,6 +3274,7 @@
             </w:pPr>
             <w:r>
               <w:rPr>
+                <w:rStyle w:val="InlineCode"/>
                 <w:rFonts w:ascii="Consolas" w:cs="Consolas" w:eastAsia="Consolas" w:hAnsi="Consolas"/>
                 <w:color w:val="334155"/>
                 <w:sz w:val="17"/>
@@ -3133,6 +3401,7 @@
             </w:pPr>
             <w:r>
               <w:rPr>
+                <w:rStyle w:val="InlineCode"/>
                 <w:rFonts w:ascii="Consolas" w:cs="Consolas" w:eastAsia="Consolas" w:hAnsi="Consolas"/>
                 <w:color w:val="334155"/>
                 <w:sz w:val="17"/>
@@ -3313,6 +3582,7 @@
             </w:pPr>
             <w:r>
               <w:rPr>
+                <w:rStyle w:val="InlineCode"/>
                 <w:rFonts w:ascii="Consolas" w:cs="Consolas" w:eastAsia="Consolas" w:hAnsi="Consolas"/>
                 <w:color w:val="334155"/>
                 <w:sz w:val="17"/>
@@ -3439,6 +3709,7 @@
             </w:pPr>
             <w:r>
               <w:rPr>
+                <w:rStyle w:val="InlineCode"/>
                 <w:rFonts w:ascii="Consolas" w:cs="Consolas" w:eastAsia="Consolas" w:hAnsi="Consolas"/>
                 <w:color w:val="334155"/>
                 <w:sz w:val="17"/>
@@ -3565,6 +3836,7 @@
             </w:pPr>
             <w:r>
               <w:rPr>
+                <w:rStyle w:val="InlineCode"/>
                 <w:rFonts w:ascii="Consolas" w:cs="Consolas" w:eastAsia="Consolas" w:hAnsi="Consolas"/>
                 <w:color w:val="334155"/>
                 <w:sz w:val="17"/>
@@ -3691,6 +3963,7 @@
             </w:pPr>
             <w:r>
               <w:rPr>
+                <w:rStyle w:val="InlineCode"/>
                 <w:rFonts w:ascii="Consolas" w:cs="Consolas" w:eastAsia="Consolas" w:hAnsi="Consolas"/>
                 <w:color w:val="334155"/>
                 <w:sz w:val="17"/>
@@ -3817,6 +4090,7 @@
             </w:pPr>
             <w:r>
               <w:rPr>
+                <w:rStyle w:val="InlineCode"/>
                 <w:rFonts w:ascii="Consolas" w:cs="Consolas" w:eastAsia="Consolas" w:hAnsi="Consolas"/>
                 <w:color w:val="334155"/>
                 <w:sz w:val="17"/>
@@ -3943,6 +4217,7 @@
             </w:pPr>
             <w:r>
               <w:rPr>
+                <w:rStyle w:val="InlineCode"/>
                 <w:rFonts w:ascii="Consolas" w:cs="Consolas" w:eastAsia="Consolas" w:hAnsi="Consolas"/>
                 <w:color w:val="334155"/>
                 <w:sz w:val="17"/>
@@ -4069,6 +4344,7 @@
             </w:pPr>
             <w:r>
               <w:rPr>
+                <w:rStyle w:val="InlineCode"/>
                 <w:rFonts w:ascii="Consolas" w:cs="Consolas" w:eastAsia="Consolas" w:hAnsi="Consolas"/>
                 <w:color w:val="334155"/>
                 <w:sz w:val="17"/>
@@ -4387,6 +4663,7 @@
             </w:pPr>
             <w:r>
               <w:rPr>
+                <w:rStyle w:val="InlineCode"/>
                 <w:rFonts w:ascii="Consolas" w:cs="Consolas" w:eastAsia="Consolas" w:hAnsi="Consolas"/>
                 <w:color w:val="334155"/>
                 <w:sz w:val="17"/>
@@ -4513,6 +4790,7 @@
             </w:pPr>
             <w:r>
               <w:rPr>
+                <w:rStyle w:val="InlineCode"/>
                 <w:rFonts w:ascii="Consolas" w:cs="Consolas" w:eastAsia="Consolas" w:hAnsi="Consolas"/>
                 <w:color w:val="334155"/>
                 <w:sz w:val="17"/>
@@ -4685,6 +4963,7 @@
             </w:pPr>
             <w:r>
               <w:rPr>
+                <w:rStyle w:val="InlineCode"/>
                 <w:rFonts w:ascii="Consolas" w:cs="Consolas" w:eastAsia="Consolas" w:hAnsi="Consolas"/>
                 <w:color w:val="334155"/>
                 <w:sz w:val="17"/>
@@ -4811,6 +5090,7 @@
             </w:pPr>
             <w:r>
               <w:rPr>
+                <w:rStyle w:val="InlineCode"/>
                 <w:rFonts w:ascii="Consolas" w:cs="Consolas" w:eastAsia="Consolas" w:hAnsi="Consolas"/>
                 <w:color w:val="334155"/>
                 <w:sz w:val="17"/>
@@ -7646,6 +7926,7 @@
             </w:r>
             <w:r>
               <w:rPr>
+                <w:rStyle w:val="InlineCode"/>
                 <w:rFonts w:ascii="Consolas" w:cs="Consolas" w:eastAsia="Consolas" w:hAnsi="Consolas"/>
                 <w:color w:val="334155"/>
                 <w:sz w:val="17"/>
@@ -7660,6 +7941,81 @@
                 <w:szCs w:val="19"/>
               </w:rPr>
               <w:t xml:space="preserve">)</w:t>
+            </w:r>
+          </w:p>
+        </w:tc>
+      </w:tr>
+      <w:tr>
+        <w:trPr>
+          <w:cantSplit/>
+        </w:trPr>
+        <w:tc>
+          <w:tcPr>
+            <w:tcW w:type="dxa" w:w="2753"/>
+            <w:tcBorders>
+              <w:top w:val="single" w:color="CBD5E1" w:sz="4"/>
+              <w:left w:val="single" w:color="CBD5E1" w:sz="4"/>
+              <w:bottom w:val="single" w:color="CBD5E1" w:sz="4"/>
+              <w:right w:val="single" w:color="CBD5E1" w:sz="4"/>
+            </w:tcBorders>
+            <w:tcMar>
+              <w:top w:type="dxa" w:w="60"/>
+              <w:left w:type="dxa" w:w="100"/>
+              <w:bottom w:type="dxa" w:w="60"/>
+              <w:right w:type="dxa" w:w="100"/>
+            </w:tcMar>
+          </w:tcPr>
+          <w:p>
+            <w:pPr>
+              <w:spacing w:after="0" w:before="0"/>
+            </w:pPr>
+            <w:r>
+              <w:rPr>
+                <w:rFonts w:ascii="Calibri" w:cs="Calibri" w:eastAsia="Calibri" w:hAnsi="Calibri"/>
+                <w:sz w:val="19"/>
+                <w:szCs w:val="19"/>
+              </w:rPr>
+              <w:t xml:space="preserve">Login dan Dasbor Guru</w:t>
+            </w:r>
+          </w:p>
+        </w:tc>
+        <w:tc>
+          <w:tcPr>
+            <w:tcW w:type="dxa" w:w="6885"/>
+            <w:tcBorders>
+              <w:top w:val="single" w:color="CBD5E1" w:sz="4"/>
+              <w:left w:val="single" w:color="CBD5E1" w:sz="4"/>
+              <w:bottom w:val="single" w:color="CBD5E1" w:sz="4"/>
+              <w:right w:val="single" w:color="CBD5E1" w:sz="4"/>
+            </w:tcBorders>
+            <w:tcMar>
+              <w:top w:type="dxa" w:w="60"/>
+              <w:left w:type="dxa" w:w="100"/>
+              <w:bottom w:type="dxa" w:w="60"/>
+              <w:right w:type="dxa" w:w="100"/>
+            </w:tcMar>
+          </w:tcPr>
+          <w:p>
+            <w:pPr>
+              <w:spacing w:after="0" w:before="0"/>
+            </w:pPr>
+            <w:r>
+              <w:rPr>
+                <w:rFonts w:ascii="Calibri" w:cs="Calibri" w:eastAsia="Calibri" w:hAnsi="Calibri"/>
+                <w:sz w:val="19"/>
+                <w:szCs w:val="19"/>
+              </w:rPr>
+              <w:t xml:space="preserve">Firebase Authentication + Cloud Firestore; progres siswa tersinkron otomatis, guru memantau semua siswa. Panduan: </w:t>
+            </w:r>
+            <w:r>
+              <w:rPr>
+                <w:rStyle w:val="InlineCode"/>
+                <w:rFonts w:ascii="Consolas" w:cs="Consolas" w:eastAsia="Consolas" w:hAnsi="Consolas"/>
+                <w:color w:val="334155"/>
+                <w:sz w:val="17"/>
+                <w:szCs w:val="17"/>
+              </w:rPr>
+              <w:t xml:space="preserve">docs/TUTORIAL_FIREBASE.md</w:t>
             </w:r>
           </w:p>
         </w:tc>
@@ -7892,6 +8248,7 @@
     </w:p>
     <w:p>
       <w:pPr>
+        <w:pStyle w:val="Code"/>
         <w:shd w:fill="F1F5F9" w:color="auto" w:val="clear"/>
         <w:spacing w:after="0" w:before="0"/>
       </w:pPr>
@@ -7907,6 +8264,7 @@
     </w:p>
     <w:p>
       <w:pPr>
+        <w:pStyle w:val="Code"/>
         <w:shd w:fill="F1F5F9" w:color="auto" w:val="clear"/>
         <w:spacing w:after="0" w:before="0"/>
       </w:pPr>
@@ -7922,6 +8280,7 @@
     </w:p>
     <w:p>
       <w:pPr>
+        <w:pStyle w:val="Code"/>
         <w:shd w:fill="F1F5F9" w:color="auto" w:val="clear"/>
         <w:spacing w:after="0" w:before="0"/>
       </w:pPr>
@@ -7937,6 +8296,7 @@
     </w:p>
     <w:p>
       <w:pPr>
+        <w:pStyle w:val="Code"/>
         <w:shd w:fill="F1F5F9" w:color="auto" w:val="clear"/>
         <w:spacing w:after="0" w:before="0"/>
       </w:pPr>
@@ -7952,6 +8312,7 @@
     </w:p>
     <w:p>
       <w:pPr>
+        <w:pStyle w:val="Code"/>
         <w:shd w:fill="F1F5F9" w:color="auto" w:val="clear"/>
         <w:spacing w:after="0" w:before="0"/>
       </w:pPr>
@@ -7967,6 +8328,7 @@
     </w:p>
     <w:p>
       <w:pPr>
+        <w:pStyle w:val="Code"/>
         <w:shd w:fill="F1F5F9" w:color="auto" w:val="clear"/>
         <w:spacing w:after="0" w:before="0"/>
       </w:pPr>
@@ -7982,6 +8344,7 @@
     </w:p>
     <w:p>
       <w:pPr>
+        <w:pStyle w:val="Code"/>
         <w:shd w:fill="F1F5F9" w:color="auto" w:val="clear"/>
         <w:spacing w:after="0" w:before="0"/>
       </w:pPr>
@@ -7997,6 +8360,71 @@
     </w:p>
     <w:p>
       <w:pPr>
+        <w:pStyle w:val="Code"/>
+        <w:shd w:fill="F1F5F9" w:color="auto" w:val="clear"/>
+        <w:spacing w:after="0" w:before="0"/>
+      </w:pPr>
+      <w:r>
+        <w:rPr>
+          <w:rFonts w:ascii="Consolas" w:cs="Consolas" w:eastAsia="Consolas" w:hAnsi="Consolas"/>
+          <w:color w:val="1E293B"/>
+          <w:sz w:val="18"/>
+          <w:szCs w:val="18"/>
+        </w:rPr>
+        <w:t xml:space="preserve">js/core/cloud.js            Login Firebase dan sinkronisasi progres</w:t>
+      </w:r>
+    </w:p>
+    <w:p>
+      <w:pPr>
+        <w:pStyle w:val="Code"/>
+        <w:shd w:fill="F1F5F9" w:color="auto" w:val="clear"/>
+        <w:spacing w:after="0" w:before="0"/>
+      </w:pPr>
+      <w:r>
+        <w:rPr>
+          <w:rFonts w:ascii="Consolas" w:cs="Consolas" w:eastAsia="Consolas" w:hAnsi="Consolas"/>
+          <w:color w:val="1E293B"/>
+          <w:sz w:val="18"/>
+          <w:szCs w:val="18"/>
+        </w:rPr>
+        <w:t xml:space="preserve">js/firebase-config.js       Konfigurasi Firebase</w:t>
+      </w:r>
+    </w:p>
+    <w:p>
+      <w:pPr>
+        <w:pStyle w:val="Code"/>
+        <w:shd w:fill="F1F5F9" w:color="auto" w:val="clear"/>
+        <w:spacing w:after="0" w:before="0"/>
+      </w:pPr>
+      <w:r>
+        <w:rPr>
+          <w:rFonts w:ascii="Consolas" w:cs="Consolas" w:eastAsia="Consolas" w:hAnsi="Consolas"/>
+          <w:color w:val="1E293B"/>
+          <w:sz w:val="18"/>
+          <w:szCs w:val="18"/>
+        </w:rPr>
+        <w:t xml:space="preserve">firestore.rules             Aturan keamanan Firestore</w:t>
+      </w:r>
+    </w:p>
+    <w:p>
+      <w:pPr>
+        <w:pStyle w:val="Code"/>
+        <w:shd w:fill="F1F5F9" w:color="auto" w:val="clear"/>
+        <w:spacing w:after="0" w:before="0"/>
+      </w:pPr>
+      <w:r>
+        <w:rPr>
+          <w:rFonts w:ascii="Consolas" w:cs="Consolas" w:eastAsia="Consolas" w:hAnsi="Consolas"/>
+          <w:color w:val="1E293B"/>
+          <w:sz w:val="18"/>
+          <w:szCs w:val="18"/>
+        </w:rPr>
+        <w:t xml:space="preserve">vendor/firebase/            Firebase JS SDK 10.14.1</w:t>
+      </w:r>
+    </w:p>
+    <w:p>
+      <w:pPr>
+        <w:pStyle w:val="Code"/>
         <w:shd w:fill="F1F5F9" w:color="auto" w:val="clear"/>
         <w:spacing w:after="0" w:before="0"/>
       </w:pPr>
@@ -8012,6 +8440,7 @@
     </w:p>
     <w:p>
       <w:pPr>
+        <w:pStyle w:val="Code"/>
         <w:shd w:fill="F1F5F9" w:color="auto" w:val="clear"/>
         <w:spacing w:after="0" w:before="0"/>
       </w:pPr>
@@ -8027,6 +8456,7 @@
     </w:p>
     <w:p>
       <w:pPr>
+        <w:pStyle w:val="Code"/>
         <w:shd w:fill="F1F5F9" w:color="auto" w:val="clear"/>
         <w:spacing w:after="0" w:before="0"/>
       </w:pPr>
@@ -8042,6 +8472,7 @@
     </w:p>
     <w:p>
       <w:pPr>
+        <w:pStyle w:val="Code"/>
         <w:shd w:fill="F1F5F9" w:color="auto" w:val="clear"/>
         <w:spacing w:after="0" w:before="0"/>
       </w:pPr>
@@ -8057,6 +8488,7 @@
     </w:p>
     <w:p>
       <w:pPr>
+        <w:pStyle w:val="Code"/>
         <w:shd w:fill="F1F5F9" w:color="auto" w:val="clear"/>
         <w:spacing w:after="0" w:before="0"/>
       </w:pPr>
@@ -8072,6 +8504,7 @@
     </w:p>
     <w:p>
       <w:pPr>
+        <w:pStyle w:val="Code"/>
         <w:shd w:fill="F1F5F9" w:color="auto" w:val="clear"/>
         <w:spacing w:after="0" w:before="0"/>
       </w:pPr>
@@ -8087,6 +8520,7 @@
     </w:p>
     <w:p>
       <w:pPr>
+        <w:pStyle w:val="Code"/>
         <w:shd w:fill="F1F5F9" w:color="auto" w:val="clear"/>
         <w:spacing w:after="0" w:before="0"/>
       </w:pPr>
@@ -8102,6 +8536,7 @@
     </w:p>
     <w:p>
       <w:pPr>
+        <w:pStyle w:val="Code"/>
         <w:shd w:fill="F1F5F9" w:color="auto" w:val="clear"/>
         <w:spacing w:after="0" w:before="0"/>
       </w:pPr>
@@ -8112,11 +8547,12 @@
           <w:sz w:val="18"/>
           <w:szCs w:val="18"/>
         </w:rPr>
-        <w:t xml:space="preserve">js/pages/*.js               Beranda, Tujuan, Petunjuk, Materi, Laboratorium, Misi, Evaluasi, Hasil</w:t>
+        <w:t xml:space="preserve">js/pages/*.js               Beranda, Tujuan, Petunjuk, Materi, Laboratorium, Misi, Evaluasi, Hasil, Masuk, Dasbor Guru</w:t>
       </w:r>
     </w:p>
     <w:p>
       <w:pPr>
+        <w:pStyle w:val="Code"/>
         <w:shd w:fill="F1F5F9" w:color="auto" w:val="clear"/>
         <w:spacing w:after="0" w:before="0"/>
       </w:pPr>
@@ -8132,6 +8568,7 @@
     </w:p>
     <w:p>
       <w:pPr>
+        <w:pStyle w:val="Code"/>
         <w:shd w:fill="F1F5F9" w:color="auto" w:val="clear"/>
         <w:spacing w:after="0" w:before="0"/>
       </w:pPr>
@@ -8143,6 +8580,22 @@
           <w:szCs w:val="18"/>
         </w:rPr>
         <w:t xml:space="preserve">docs/INDEKS_PROYEK.md       Dokumen ini</w:t>
+      </w:r>
+    </w:p>
+    <w:p>
+      <w:pPr>
+        <w:pStyle w:val="Code"/>
+        <w:shd w:fill="F1F5F9" w:color="auto" w:val="clear"/>
+        <w:spacing w:after="0" w:before="0"/>
+      </w:pPr>
+      <w:r>
+        <w:rPr>
+          <w:rFonts w:ascii="Consolas" w:cs="Consolas" w:eastAsia="Consolas" w:hAnsi="Consolas"/>
+          <w:color w:val="1E293B"/>
+          <w:sz w:val="18"/>
+          <w:szCs w:val="18"/>
+        </w:rPr>
+        <w:t xml:space="preserve">docs/TUTORIAL_FIREBASE.md   Tutorial login dan dasbor guru</w:t>
       </w:r>
     </w:p>
     <w:p>
@@ -8219,6 +8672,7 @@
     </w:p>
     <w:p>
       <w:pPr>
+        <w:pStyle w:val="Code"/>
         <w:shd w:fill="F1F5F9" w:color="auto" w:val="clear"/>
         <w:spacing w:after="0" w:before="0"/>
       </w:pPr>
@@ -8268,10 +8722,10 @@
         <w:tblLayout w:type="fixed"/>
       </w:tblPr>
       <w:tblGrid>
-        <w:gridCol w:w="1740"/>
-        <w:gridCol w:w="2972"/>
-        <w:gridCol w:w="2972"/>
-        <w:gridCol w:w="1954"/>
+        <w:gridCol w:w="1580"/>
+        <w:gridCol w:w="2698"/>
+        <w:gridCol w:w="2698"/>
+        <w:gridCol w:w="2662"/>
       </w:tblGrid>
       <w:tr>
         <w:trPr>
@@ -8280,7 +8734,7 @@
         </w:trPr>
         <w:tc>
           <w:tcPr>
-            <w:tcW w:type="dxa" w:w="1740"/>
+            <w:tcW w:type="dxa" w:w="1580"/>
             <w:tcBorders>
               <w:top w:val="single" w:color="CBD5E1" w:sz="4"/>
               <w:left w:val="single" w:color="CBD5E1" w:sz="4"/>
@@ -8314,7 +8768,7 @@
         </w:tc>
         <w:tc>
           <w:tcPr>
-            <w:tcW w:type="dxa" w:w="2972"/>
+            <w:tcW w:type="dxa" w:w="2698"/>
             <w:tcBorders>
               <w:top w:val="single" w:color="CBD5E1" w:sz="4"/>
               <w:left w:val="single" w:color="CBD5E1" w:sz="4"/>
@@ -8348,7 +8802,7 @@
         </w:tc>
         <w:tc>
           <w:tcPr>
-            <w:tcW w:type="dxa" w:w="2972"/>
+            <w:tcW w:type="dxa" w:w="2698"/>
             <w:tcBorders>
               <w:top w:val="single" w:color="CBD5E1" w:sz="4"/>
               <w:left w:val="single" w:color="CBD5E1" w:sz="4"/>
@@ -8382,7 +8836,7 @@
         </w:tc>
         <w:tc>
           <w:tcPr>
-            <w:tcW w:type="dxa" w:w="1954"/>
+            <w:tcW w:type="dxa" w:w="2662"/>
             <w:tcBorders>
               <w:top w:val="single" w:color="CBD5E1" w:sz="4"/>
               <w:left w:val="single" w:color="CBD5E1" w:sz="4"/>
@@ -8421,7 +8875,7 @@
         </w:trPr>
         <w:tc>
           <w:tcPr>
-            <w:tcW w:type="dxa" w:w="1740"/>
+            <w:tcW w:type="dxa" w:w="1580"/>
             <w:tcBorders>
               <w:top w:val="single" w:color="CBD5E1" w:sz="4"/>
               <w:left w:val="single" w:color="CBD5E1" w:sz="4"/>
@@ -8453,91 +8907,91 @@
         </w:tc>
         <w:tc>
           <w:tcPr>
-            <w:tcW w:type="dxa" w:w="2972"/>
-            <w:tcBorders>
-              <w:top w:val="single" w:color="CBD5E1" w:sz="4"/>
-              <w:left w:val="single" w:color="CBD5E1" w:sz="4"/>
-              <w:bottom w:val="single" w:color="CBD5E1" w:sz="4"/>
-              <w:right w:val="single" w:color="CBD5E1" w:sz="4"/>
-            </w:tcBorders>
-            <w:tcMar>
-              <w:top w:type="dxa" w:w="60"/>
-              <w:left w:type="dxa" w:w="100"/>
-              <w:bottom w:type="dxa" w:w="60"/>
-              <w:right w:type="dxa" w:w="100"/>
-            </w:tcMar>
-          </w:tcPr>
-          <w:p>
-            <w:pPr>
-              <w:spacing w:after="0" w:before="0"/>
-            </w:pPr>
-            <w:r>
-              <w:rPr>
-                <w:rFonts w:ascii="Calibri" w:cs="Calibri" w:eastAsia="Calibri" w:hAnsi="Calibri"/>
-                <w:sz w:val="19"/>
-                <w:szCs w:val="19"/>
-              </w:rPr>
-              <w:t xml:space="preserve">Membuka Beranda, membaca Tujuan dan Petunjuk</w:t>
-            </w:r>
-          </w:p>
-        </w:tc>
-        <w:tc>
-          <w:tcPr>
-            <w:tcW w:type="dxa" w:w="2972"/>
-            <w:tcBorders>
-              <w:top w:val="single" w:color="CBD5E1" w:sz="4"/>
-              <w:left w:val="single" w:color="CBD5E1" w:sz="4"/>
-              <w:bottom w:val="single" w:color="CBD5E1" w:sz="4"/>
-              <w:right w:val="single" w:color="CBD5E1" w:sz="4"/>
-            </w:tcBorders>
-            <w:tcMar>
-              <w:top w:type="dxa" w:w="60"/>
-              <w:left w:type="dxa" w:w="100"/>
-              <w:bottom w:type="dxa" w:w="60"/>
-              <w:right w:type="dxa" w:w="100"/>
-            </w:tcMar>
-          </w:tcPr>
-          <w:p>
-            <w:pPr>
-              <w:spacing w:after="0" w:before="0"/>
-            </w:pPr>
-            <w:r>
-              <w:rPr>
-                <w:rFonts w:ascii="Calibri" w:cs="Calibri" w:eastAsia="Calibri" w:hAnsi="Calibri"/>
-                <w:sz w:val="19"/>
-                <w:szCs w:val="19"/>
-              </w:rPr>
-              <w:t xml:space="preserve">Menjelaskan TP dan aturan permainan</w:t>
-            </w:r>
-          </w:p>
-        </w:tc>
-        <w:tc>
-          <w:tcPr>
-            <w:tcW w:type="dxa" w:w="1954"/>
-            <w:tcBorders>
-              <w:top w:val="single" w:color="CBD5E1" w:sz="4"/>
-              <w:left w:val="single" w:color="CBD5E1" w:sz="4"/>
-              <w:bottom w:val="single" w:color="CBD5E1" w:sz="4"/>
-              <w:right w:val="single" w:color="CBD5E1" w:sz="4"/>
-            </w:tcBorders>
-            <w:tcMar>
-              <w:top w:type="dxa" w:w="60"/>
-              <w:left w:type="dxa" w:w="100"/>
-              <w:bottom w:type="dxa" w:w="60"/>
-              <w:right w:type="dxa" w:w="100"/>
-            </w:tcMar>
-          </w:tcPr>
-          <w:p>
-            <w:pPr>
-              <w:spacing w:after="0" w:before="0"/>
-            </w:pPr>
-            <w:r>
-              <w:rPr>
-                <w:rFonts w:ascii="Calibri" w:cs="Calibri" w:eastAsia="Calibri" w:hAnsi="Calibri"/>
-                <w:sz w:val="19"/>
-                <w:szCs w:val="19"/>
-              </w:rPr>
-              <w:t xml:space="preserve">Siswa mengetahui TP dan sistem skor</w:t>
+            <w:tcW w:type="dxa" w:w="2698"/>
+            <w:tcBorders>
+              <w:top w:val="single" w:color="CBD5E1" w:sz="4"/>
+              <w:left w:val="single" w:color="CBD5E1" w:sz="4"/>
+              <w:bottom w:val="single" w:color="CBD5E1" w:sz="4"/>
+              <w:right w:val="single" w:color="CBD5E1" w:sz="4"/>
+            </w:tcBorders>
+            <w:tcMar>
+              <w:top w:type="dxa" w:w="60"/>
+              <w:left w:type="dxa" w:w="100"/>
+              <w:bottom w:type="dxa" w:w="60"/>
+              <w:right w:type="dxa" w:w="100"/>
+            </w:tcMar>
+          </w:tcPr>
+          <w:p>
+            <w:pPr>
+              <w:spacing w:after="0" w:before="0"/>
+            </w:pPr>
+            <w:r>
+              <w:rPr>
+                <w:rFonts w:ascii="Calibri" w:cs="Calibri" w:eastAsia="Calibri" w:hAnsi="Calibri"/>
+                <w:sz w:val="19"/>
+                <w:szCs w:val="19"/>
+              </w:rPr>
+              <w:t xml:space="preserve">Mendaftar akun (jika login aktif), membuka Beranda, membaca Tujuan dan Petunjuk</w:t>
+            </w:r>
+          </w:p>
+        </w:tc>
+        <w:tc>
+          <w:tcPr>
+            <w:tcW w:type="dxa" w:w="2698"/>
+            <w:tcBorders>
+              <w:top w:val="single" w:color="CBD5E1" w:sz="4"/>
+              <w:left w:val="single" w:color="CBD5E1" w:sz="4"/>
+              <w:bottom w:val="single" w:color="CBD5E1" w:sz="4"/>
+              <w:right w:val="single" w:color="CBD5E1" w:sz="4"/>
+            </w:tcBorders>
+            <w:tcMar>
+              <w:top w:type="dxa" w:w="60"/>
+              <w:left w:type="dxa" w:w="100"/>
+              <w:bottom w:type="dxa" w:w="60"/>
+              <w:right w:type="dxa" w:w="100"/>
+            </w:tcMar>
+          </w:tcPr>
+          <w:p>
+            <w:pPr>
+              <w:spacing w:after="0" w:before="0"/>
+            </w:pPr>
+            <w:r>
+              <w:rPr>
+                <w:rFonts w:ascii="Calibri" w:cs="Calibri" w:eastAsia="Calibri" w:hAnsi="Calibri"/>
+                <w:sz w:val="19"/>
+                <w:szCs w:val="19"/>
+              </w:rPr>
+              <w:t xml:space="preserve">Menjelaskan TP dan aturan permainan, memastikan semua siswa berhasil masuk</w:t>
+            </w:r>
+          </w:p>
+        </w:tc>
+        <w:tc>
+          <w:tcPr>
+            <w:tcW w:type="dxa" w:w="2662"/>
+            <w:tcBorders>
+              <w:top w:val="single" w:color="CBD5E1" w:sz="4"/>
+              <w:left w:val="single" w:color="CBD5E1" w:sz="4"/>
+              <w:bottom w:val="single" w:color="CBD5E1" w:sz="4"/>
+              <w:right w:val="single" w:color="CBD5E1" w:sz="4"/>
+            </w:tcBorders>
+            <w:tcMar>
+              <w:top w:type="dxa" w:w="60"/>
+              <w:left w:type="dxa" w:w="100"/>
+              <w:bottom w:type="dxa" w:w="60"/>
+              <w:right w:type="dxa" w:w="100"/>
+            </w:tcMar>
+          </w:tcPr>
+          <w:p>
+            <w:pPr>
+              <w:spacing w:after="0" w:before="0"/>
+            </w:pPr>
+            <w:r>
+              <w:rPr>
+                <w:rFonts w:ascii="Calibri" w:cs="Calibri" w:eastAsia="Calibri" w:hAnsi="Calibri"/>
+                <w:sz w:val="19"/>
+                <w:szCs w:val="19"/>
+              </w:rPr>
+              <w:t xml:space="preserve">Siswa mengetahui TP dan sistem skor; nama siswa muncul di Dasbor Guru</w:t>
             </w:r>
           </w:p>
         </w:tc>
@@ -8548,7 +9002,7 @@
         </w:trPr>
         <w:tc>
           <w:tcPr>
-            <w:tcW w:type="dxa" w:w="1740"/>
+            <w:tcW w:type="dxa" w:w="1580"/>
             <w:tcBorders>
               <w:top w:val="single" w:color="CBD5E1" w:sz="4"/>
               <w:left w:val="single" w:color="CBD5E1" w:sz="4"/>
@@ -8580,7 +9034,7 @@
         </w:tc>
         <w:tc>
           <w:tcPr>
-            <w:tcW w:type="dxa" w:w="2972"/>
+            <w:tcW w:type="dxa" w:w="2698"/>
             <w:tcBorders>
               <w:top w:val="single" w:color="CBD5E1" w:sz="4"/>
               <w:left w:val="single" w:color="CBD5E1" w:sz="4"/>
@@ -8610,7 +9064,7 @@
         </w:tc>
         <w:tc>
           <w:tcPr>
-            <w:tcW w:type="dxa" w:w="2972"/>
+            <w:tcW w:type="dxa" w:w="2698"/>
             <w:tcBorders>
               <w:top w:val="single" w:color="CBD5E1" w:sz="4"/>
               <w:left w:val="single" w:color="CBD5E1" w:sz="4"/>
@@ -8640,7 +9094,7 @@
         </w:tc>
         <w:tc>
           <w:tcPr>
-            <w:tcW w:type="dxa" w:w="1954"/>
+            <w:tcW w:type="dxa" w:w="2662"/>
             <w:tcBorders>
               <w:top w:val="single" w:color="CBD5E1" w:sz="4"/>
               <w:left w:val="single" w:color="CBD5E1" w:sz="4"/>
@@ -8675,7 +9129,7 @@
         </w:trPr>
         <w:tc>
           <w:tcPr>
-            <w:tcW w:type="dxa" w:w="1740"/>
+            <w:tcW w:type="dxa" w:w="1580"/>
             <w:tcBorders>
               <w:top w:val="single" w:color="CBD5E1" w:sz="4"/>
               <w:left w:val="single" w:color="CBD5E1" w:sz="4"/>
@@ -8707,7 +9161,7 @@
         </w:tc>
         <w:tc>
           <w:tcPr>
-            <w:tcW w:type="dxa" w:w="2972"/>
+            <w:tcW w:type="dxa" w:w="2698"/>
             <w:tcBorders>
               <w:top w:val="single" w:color="CBD5E1" w:sz="4"/>
               <w:left w:val="single" w:color="CBD5E1" w:sz="4"/>
@@ -8737,7 +9191,7 @@
         </w:tc>
         <w:tc>
           <w:tcPr>
-            <w:tcW w:type="dxa" w:w="2972"/>
+            <w:tcW w:type="dxa" w:w="2698"/>
             <w:tcBorders>
               <w:top w:val="single" w:color="CBD5E1" w:sz="4"/>
               <w:left w:val="single" w:color="CBD5E1" w:sz="4"/>
@@ -8767,7 +9221,7 @@
         </w:tc>
         <w:tc>
           <w:tcPr>
-            <w:tcW w:type="dxa" w:w="1954"/>
+            <w:tcW w:type="dxa" w:w="2662"/>
             <w:tcBorders>
               <w:top w:val="single" w:color="CBD5E1" w:sz="4"/>
               <w:left w:val="single" w:color="CBD5E1" w:sz="4"/>
@@ -8802,7 +9256,7 @@
         </w:trPr>
         <w:tc>
           <w:tcPr>
-            <w:tcW w:type="dxa" w:w="1740"/>
+            <w:tcW w:type="dxa" w:w="1580"/>
             <w:tcBorders>
               <w:top w:val="single" w:color="CBD5E1" w:sz="4"/>
               <w:left w:val="single" w:color="CBD5E1" w:sz="4"/>
@@ -8834,7 +9288,7 @@
         </w:tc>
         <w:tc>
           <w:tcPr>
-            <w:tcW w:type="dxa" w:w="2972"/>
+            <w:tcW w:type="dxa" w:w="2698"/>
             <w:tcBorders>
               <w:top w:val="single" w:color="CBD5E1" w:sz="4"/>
               <w:left w:val="single" w:color="CBD5E1" w:sz="4"/>
@@ -8864,7 +9318,7 @@
         </w:tc>
         <w:tc>
           <w:tcPr>
-            <w:tcW w:type="dxa" w:w="2972"/>
+            <w:tcW w:type="dxa" w:w="2698"/>
             <w:tcBorders>
               <w:top w:val="single" w:color="CBD5E1" w:sz="4"/>
               <w:left w:val="single" w:color="CBD5E1" w:sz="4"/>
@@ -8894,7 +9348,7 @@
         </w:tc>
         <w:tc>
           <w:tcPr>
-            <w:tcW w:type="dxa" w:w="1954"/>
+            <w:tcW w:type="dxa" w:w="2662"/>
             <w:tcBorders>
               <w:top w:val="single" w:color="CBD5E1" w:sz="4"/>
               <w:left w:val="single" w:color="CBD5E1" w:sz="4"/>
@@ -8929,7 +9383,7 @@
         </w:trPr>
         <w:tc>
           <w:tcPr>
-            <w:tcW w:type="dxa" w:w="1740"/>
+            <w:tcW w:type="dxa" w:w="1580"/>
             <w:tcBorders>
               <w:top w:val="single" w:color="CBD5E1" w:sz="4"/>
               <w:left w:val="single" w:color="CBD5E1" w:sz="4"/>
@@ -8961,7 +9415,7 @@
         </w:tc>
         <w:tc>
           <w:tcPr>
-            <w:tcW w:type="dxa" w:w="2972"/>
+            <w:tcW w:type="dxa" w:w="2698"/>
             <w:tcBorders>
               <w:top w:val="single" w:color="CBD5E1" w:sz="4"/>
               <w:left w:val="single" w:color="CBD5E1" w:sz="4"/>
@@ -8991,37 +9445,37 @@
         </w:tc>
         <w:tc>
           <w:tcPr>
-            <w:tcW w:type="dxa" w:w="2972"/>
-            <w:tcBorders>
-              <w:top w:val="single" w:color="CBD5E1" w:sz="4"/>
-              <w:left w:val="single" w:color="CBD5E1" w:sz="4"/>
-              <w:bottom w:val="single" w:color="CBD5E1" w:sz="4"/>
-              <w:right w:val="single" w:color="CBD5E1" w:sz="4"/>
-            </w:tcBorders>
-            <w:tcMar>
-              <w:top w:type="dxa" w:w="60"/>
-              <w:left w:type="dxa" w:w="100"/>
-              <w:bottom w:type="dxa" w:w="60"/>
-              <w:right w:type="dxa" w:w="100"/>
-            </w:tcMar>
-          </w:tcPr>
-          <w:p>
-            <w:pPr>
-              <w:spacing w:after="0" w:before="0"/>
-            </w:pPr>
-            <w:r>
-              <w:rPr>
-                <w:rFonts w:ascii="Calibri" w:cs="Calibri" w:eastAsia="Calibri" w:hAnsi="Calibri"/>
-                <w:sz w:val="19"/>
-                <w:szCs w:val="19"/>
-              </w:rPr>
-              <w:t xml:space="preserve">Membahas soal yang banyak salah, menindaklanjuti TP berstatus "Perlu penguatan"</w:t>
-            </w:r>
-          </w:p>
-        </w:tc>
-        <w:tc>
-          <w:tcPr>
-            <w:tcW w:type="dxa" w:w="1954"/>
+            <w:tcW w:type="dxa" w:w="2698"/>
+            <w:tcBorders>
+              <w:top w:val="single" w:color="CBD5E1" w:sz="4"/>
+              <w:left w:val="single" w:color="CBD5E1" w:sz="4"/>
+              <w:bottom w:val="single" w:color="CBD5E1" w:sz="4"/>
+              <w:right w:val="single" w:color="CBD5E1" w:sz="4"/>
+            </w:tcBorders>
+            <w:tcMar>
+              <w:top w:type="dxa" w:w="60"/>
+              <w:left w:type="dxa" w:w="100"/>
+              <w:bottom w:type="dxa" w:w="60"/>
+              <w:right w:type="dxa" w:w="100"/>
+            </w:tcMar>
+          </w:tcPr>
+          <w:p>
+            <w:pPr>
+              <w:spacing w:after="0" w:before="0"/>
+            </w:pPr>
+            <w:r>
+              <w:rPr>
+                <w:rFonts w:ascii="Calibri" w:cs="Calibri" w:eastAsia="Calibri" w:hAnsi="Calibri"/>
+                <w:sz w:val="19"/>
+                <w:szCs w:val="19"/>
+              </w:rPr>
+              <w:t xml:space="preserve">Memantau Dasbor Guru, menilai jawaban uraian, membahas soal yang banyak salah, menindaklanjuti TP berstatus "Perlu penguatan"</w:t>
+            </w:r>
+          </w:p>
+        </w:tc>
+        <w:tc>
+          <w:tcPr>
+            <w:tcW w:type="dxa" w:w="2662"/>
             <w:tcBorders>
               <w:top w:val="single" w:color="CBD5E1" w:sz="4"/>
               <w:left w:val="single" w:color="CBD5E1" w:sz="4"/>
@@ -9086,7 +9540,7 @@
         <w:rPr>
           <w:rFonts w:ascii="Calibri" w:cs="Calibri" w:eastAsia="Calibri" w:hAnsi="Calibri"/>
         </w:rPr>
-        <w:t xml:space="preserve">Progres tersimpan di perangkat masing-masing; siswa sebaiknya memakai perangkat yang sama selama rangkaian kegiatan.</w:t>
+        <w:t xml:space="preserve">Tanpa login, progres tersimpan di perangkat masing-masing. Dengan login Firebase aktif, progres mengikuti akun siswa sehingga dapat dilanjutkan di perangkat lain dan dipantau guru.</w:t>
       </w:r>
     </w:p>
     <w:p>
@@ -9576,6 +10030,27 @@
       <w:szCs w:val="20"/>
     </w:rPr>
   </w:style>
+  <w:style w:type="paragraph" w:styleId="Code">
+    <w:name w:val="Code"/>
+    <w:basedOn w:val="Normal"/>
+    <w:pPr>
+      <w:spacing w:after="0" w:before="0"/>
+    </w:pPr>
+    <w:rPr>
+      <w:rFonts w:ascii="Consolas" w:cs="Consolas" w:eastAsia="Consolas" w:hAnsi="Consolas"/>
+      <w:sz w:val="18"/>
+      <w:szCs w:val="18"/>
+    </w:rPr>
+  </w:style>
+  <w:style w:type="character" w:styleId="InlineCode">
+    <w:name w:val="InlineCode"/>
+    <w:uiPriority w:val="99"/>
+    <w:unhideWhenUsed/>
+    <w:rPr>
+      <w:rFonts w:ascii="Consolas" w:cs="Consolas" w:eastAsia="Consolas" w:hAnsi="Consolas"/>
+      <w:color w:val="334155"/>
+    </w:rPr>
+  </w:style>
 </w:styles>
 </file>
 

</xml_diff>